<commit_message>
Drop the board adoption/signatures page from the imported body
The Remuneration original bakes an 'As adopted by the Board of Directors' page
with signature lines (a two-column names block) into the document. It was
imported into the body, so the signed variant showed the signatures twice
(body + the formatter's board page) and the unsigned variant showed them at all.
Detect the board marker in block, table AND column items and cut it (with the
version card) from the import. Signed now has one board page; unsigned has none.

Co-Authored-By: Claude Opus 4.8 <noreply@anthropic.com>
Claude-Session: https://claude.ai/code/session_01W3gw8scX9B7oMC33JPxjbS
</commit_message>
<xml_diff>
--- a/policies/sources/remuneration-policy__Approval.docx
+++ b/policies/sources/remuneration-policy__Approval.docx
@@ -543,84 +543,6 @@
         <w:t>In case of extraordinary events, the Board of Directors may lay down specific terms for incentive- based remuneration governing the lapsing, repayment, capping of ultimate gains or other adjustments of the incentive-based remuneration, including accelerated vesting or exercise and adjustment to the exercise price or the performance targets. Such extraordinary event may include, but is not limited to, significant divestiture of activities, change in capital structure, demerger, merger or other business combination involving the Company or material parts of the Group, a member of Executive Management resigning/being dismissed or other material events that would otherwise positively or negatively influence</w:t>
       </w:r>
     </w:p>
-    <w:tbl>
-      <w:tblPr>
-        <w:tblW w:type="auto" w:w="0"/>
-        <w:tblLook w:firstColumn="1" w:firstRow="1" w:lastColumn="0" w:lastRow="0" w:noHBand="0" w:noVBand="1" w:val="04A0"/>
-      </w:tblPr>
-      <w:tblGrid>
-        <w:gridCol w:w="4320"/>
-        <w:gridCol w:w="4320"/>
-      </w:tblGrid>
-      <w:tr>
-        <w:tc>
-          <w:tcPr>
-            <w:tcW w:type="dxa" w:w="4320"/>
-          </w:tcPr>
-          <w:p>
-            <w:r>
-              <w:t>As adopted by the Board of Directors of BioMar Group on February 27th 2023 to take effect from March 1st 2023.</w:t>
-            </w:r>
-          </w:p>
-          <w:p>
-            <w:r>
-              <w:t>_______________________</w:t>
-            </w:r>
-          </w:p>
-          <w:p>
-            <w:r>
-              <w:t>Jens Bjerg Sørensen</w:t>
-            </w:r>
-          </w:p>
-          <w:p>
-            <w:r>
-              <w:t>_________________________</w:t>
-            </w:r>
-          </w:p>
-          <w:p>
-            <w:r>
-              <w:t>Asbjørn Reinkind</w:t>
-            </w:r>
-          </w:p>
-          <w:p>
-            <w:r>
-              <w:t>_______________________</w:t>
-            </w:r>
-          </w:p>
-          <w:p>
-            <w:r>
-              <w:t>Jørgen Wisborg</w:t>
-            </w:r>
-          </w:p>
-        </w:tc>
-        <w:tc>
-          <w:tcPr>
-            <w:tcW w:type="dxa" w:w="4320"/>
-          </w:tcPr>
-          <w:p>
-            <w:r>
-              <w:t>______________________</w:t>
-            </w:r>
-          </w:p>
-          <w:p>
-            <w:r>
-              <w:t>Marianne Kirkegaard</w:t>
-            </w:r>
-          </w:p>
-          <w:p>
-            <w:r>
-              <w:t>__________________________</w:t>
-            </w:r>
-          </w:p>
-          <w:p>
-            <w:r>
-              <w:t>Anders Wilhjelm</w:t>
-            </w:r>
-          </w:p>
-        </w:tc>
-      </w:tr>
-    </w:tbl>
-    <w:p/>
     <w:sectPr>
       <w:pgSz w:w="12240" w:h="15840"/>
       <w:pgMar w:top="1440" w:right="1800" w:bottom="1440" w:left="1800" w:header="720" w:footer="720" w:gutter="0"/>

</xml_diff>